<commit_message>
Remove cross-place warnings from Macau book; spec: write each book standalone
Co-Authored-By: Claude Opus 5.5 <noreply@anthropic.com>
Claude-Session: https://claude.ai/code/session_01BkUHvVtkxEBBCip6XRXoJu
</commit_message>
<xml_diff>
--- a/worldbook/澳门背景世界书by鲷鱼烧.docx
+++ b/worldbook/澳门背景世界书by鲷鱼烧.docx
@@ -364,7 +364,7 @@
     </w:p>
     <w:p>
       <w:r>
-        <w:t>- 台词用粤语口语字，附普通话翻译；用澳门的说法（BI、发财车、澳门通、经屋社屋），不用只有别处才有的说法。</w:t>
+        <w:t>- 台词用粤语口语字，附普通话翻译；用澳门的说法（BI、发财车、澳门通、经屋社屋）。</w:t>
       </w:r>
     </w:p>
     <w:p>
@@ -1448,7 +1448,7 @@
     </w:p>
     <w:p>
       <w:r>
-        <w:t>- 身份在场景里通常是一些小时刻：被游客问「你哋講葡文㗎？」（你们说葡文吗？）、出外读书时被当成香港人、回归纪念日的升旗。不让角色就身份长篇议论。</w:t>
+        <w:t>- 身份在场景里通常是一些小时刻：被游客问「你哋講葡文㗎？」（你们说葡文吗？）、出外读书时被问「澳門喺邊度？」（澳门在哪里？）、回归纪念日的升旗。不让角色就身份长篇议论。</w:t>
       </w:r>
     </w:p>
     <w:p/>
@@ -2642,7 +2642,7 @@
     </w:p>
     <w:p>
       <w:r>
-        <w:t>为什么：模型的中文语料以普通话为主，澳门角色很容易被写成"说普通话的人"，或者被写成香港人，或者翻译时被加重、被换成大陆网络用语。一句话不对，角色就从澳门的街上掉了出去。</w:t>
+        <w:t>为什么：模型的中文语料以普通话为主，澳门角色很容易被写成"说普通话的人"，或者翻译时被加重、被换成大陆网络用语。一句话不对，角色就从澳门的街上掉了出去。</w:t>
       </w:r>
     </w:p>
     <w:p/>
@@ -2792,11 +2792,6 @@
     <w:p>
       <w:r>
         <w:t>- 大陆用语：打车（的士）、视频（片）、手机号码（電話號碼）、外卖小哥、小区（屋苑、大廈）。</w:t>
-      </w:r>
-    </w:p>
-    <w:p>
-      <w:r>
-        <w:t>- 香港专有的说法放在澳门角色嘴里会显得不对：港铁（澳门没有港铁，有轻轨和巴士）、八达通（澳门用澳门通）、屋邨（澳门说社屋、经屋）。</w:t>
       </w:r>
     </w:p>
     <w:p>

</xml_diff>